<commit_message>
Add build story and live demo link to ALIA overview
Co-Authored-By: Claude Opus 5.5 <noreply@anthropic.com>
Claude-Session: https://claude.ai/code/session_01FANTJs5xruhcuDkGAQu45x
</commit_message>
<xml_diff>
--- a/alia-access-guardrail/docs/ALIA-Project-Overview.docx
+++ b/alia-access-guardrail/docs/ALIA-Project-Overview.docx
@@ -68,6 +68,26 @@
       <w:r>
         <w:t xml:space="preserve">. It runs entirely in the browser: no backend, no database, no customer data.</w:t>
       </w:r>
+    </w:p>
+    <w:p>
+      <w:pPr/>
+      <w:r>
+        <w:rPr>
+          <w:b/>
+        </w:rPr>
+        <w:t xml:space="preserve">Live demo:</w:t>
+      </w:r>
+      <w:r>
+        <w:t xml:space="preserve"> </w:t>
+      </w:r>
+      <w:hyperlink r:id="rId3" w:history="1">
+        <w:r>
+          <w:rPr>
+            <w:rStyle w:val="Hyperlink"/>
+          </w:rPr>
+          <w:t xml:space="preserve">alia-brown.vercel.app</w:t>
+        </w:r>
+      </w:hyperlink>
     </w:p>
     <w:p>
       <w:pPr>
@@ -148,7 +168,13 @@
     <w:p>
       <w:pPr/>
       <w:r>
-        <w:t xml:space="preserve">I wanted to show how I'd add value at Alia, not just talk about it. I looked for a gap that matters to the business and that nobody else was covering. Popup accessibility fit: it carries real legal risk for merchants, Alia's competitors already address it, and Alia controls the shared code that could fix it for every store at once.</w:t>
+        <w:t xml:space="preserve">While looking at Alia's product, I saw a gap: its popup appears on every merchant's storefront, yet nothing told merchants whether it was accessible, and Alia's help center had no accessibility documentation. Its competitors already covered it. So instead of just pointing out the gap, I built the tool that closes it.</w:t>
+      </w:r>
+    </w:p>
+    <w:p>
+      <w:pPr/>
+      <w:r>
+        <w:t xml:space="preserve">The gap mattered for three reasons. It carries real legal risk for merchants. Alia's competitors already address it. And Alia controls the shared popup code, so one fix protects every store at once.</w:t>
       </w:r>
     </w:p>
     <w:p>
@@ -158,15 +184,20 @@
       </w:r>
     </w:p>
     <w:p>
-      <w:pPr>
-        <w:pStyle w:val="ListParagraph"/>
-        <w:numPr>
-          <w:ilvl w:val="0"/>
-          <w:numId w:val="3"/>
-        </w:numPr>
-      </w:pPr>
-      <w:r>
-        <w:t xml:space="preserve">☐ Open question: add your own story here (for example, what made you notice this gap or why accessibility matters to you).</w:t>
+      <w:pPr/>
+      <w:r>
+        <w:t xml:space="preserve">Try it yourself: </w:t>
+      </w:r>
+      <w:hyperlink r:id="rId3" w:history="1">
+        <w:r>
+          <w:rPr>
+            <w:rStyle w:val="Hyperlink"/>
+          </w:rPr>
+          <w:t xml:space="preserve">alia-brown.vercel.app</w:t>
+        </w:r>
+      </w:hyperlink>
+      <w:r>
+        <w:t xml:space="preserve">. Flip the Before / After toggle to see the score go from 13 to 100.</w:t>
       </w:r>
     </w:p>
     <w:p>
@@ -192,7 +223,7 @@
                     <pic:cNvPicPr/>
                   </pic:nvPicPr>
                   <pic:blipFill>
-                    <a:blip r:embed="rId3"/>
+                    <a:blip r:embed="rId4"/>
                     <a:stretch>
                       <a:fillRect/>
                     </a:stretch>
@@ -735,7 +766,7 @@
         <w:pStyle w:val="ListParagraph"/>
         <w:numPr>
           <w:ilvl w:val="0"/>
-          <w:numId w:val="4"/>
+          <w:numId w:val="3"/>
         </w:numPr>
       </w:pPr>
       <w:r>
@@ -746,6 +777,48 @@
       </w:r>
       <w:r>
         <w:t xml:space="preserve"> axe-core catches contrast and missing labels. It can't tell whether focus escapes a dialog or whether Escape closes it. I wrote custom probes for that.</w:t>
+      </w:r>
+    </w:p>
+    <w:p>
+      <w:pPr>
+        <w:pStyle w:val="ListParagraph"/>
+        <w:numPr>
+          <w:ilvl w:val="0"/>
+          <w:numId w:val="3"/>
+        </w:numPr>
+      </w:pPr>
+      <w:r>
+        <w:rPr>
+          <w:b/>
+        </w:rPr>
+        <w:t xml:space="preserve">The tool has to pass its own test.</w:t>
+      </w:r>
+      <w:r>
+        <w:t xml:space="preserve"> The auditor is fully keyboard-operable, has visible focus rings, and respects reduced-motion settings.</w:t>
+      </w:r>
+    </w:p>
+    <w:p>
+      <w:pPr>
+        <w:pStyle w:val="ListParagraph"/>
+        <w:numPr>
+          <w:ilvl w:val="0"/>
+          <w:numId w:val="3"/>
+        </w:numPr>
+      </w:pPr>
+      <w:r>
+        <w:rPr>
+          <w:b/>
+        </w:rPr>
+        <w:t xml:space="preserve">Design for change.</w:t>
+      </w:r>
+      <w:r>
+        <w:t xml:space="preserve"> All brand colors live in one CSS token block that mirrors Alia's editor slots, so re-theming takes four lines.</w:t>
+      </w:r>
+    </w:p>
+    <w:p>
+      <w:pPr/>
+      <w:r>
+        <w:t xml:space="preserve">Next steps if this went into production:</w:t>
       </w:r>
     </w:p>
     <w:p>
@@ -757,13 +830,7 @@
         </w:numPr>
       </w:pPr>
       <w:r>
-        <w:rPr>
-          <w:b/>
-        </w:rPr>
-        <w:t xml:space="preserve">The tool has to pass its own test.</w:t>
-      </w:r>
-      <w:r>
-        <w:t xml:space="preserve"> The auditor is fully keyboard-operable, has visible focus rings, and respects reduced-motion settings.</w:t>
+        <w:t xml:space="preserve">Run the audit against merchants' real popup configurations instead of the three sample popups.</w:t>
       </w:r>
     </w:p>
     <w:p>
@@ -775,19 +842,7 @@
         </w:numPr>
       </w:pPr>
       <w:r>
-        <w:rPr>
-          <w:b/>
-        </w:rPr>
-        <w:t xml:space="preserve">Design for change.</w:t>
-      </w:r>
-      <w:r>
-        <w:t xml:space="preserve"> All brand colors live in one CSS token block that mirrors Alia's editor slots, so re-theming takes four lines.</w:t>
-      </w:r>
-    </w:p>
-    <w:p>
-      <w:pPr/>
-      <w:r>
-        <w:t xml:space="preserve">Next steps if this went into production:</w:t>
+        <w:t xml:space="preserve">Add the score to the popup editor so merchants see it before they publish.</w:t>
       </w:r>
     </w:p>
     <w:p>
@@ -795,31 +850,7 @@
         <w:pStyle w:val="ListParagraph"/>
         <w:numPr>
           <w:ilvl w:val="0"/>
-          <w:numId w:val="5"/>
-        </w:numPr>
-      </w:pPr>
-      <w:r>
-        <w:t xml:space="preserve">Run the audit against merchants' real popup configurations instead of the three sample popups.</w:t>
-      </w:r>
-    </w:p>
-    <w:p>
-      <w:pPr>
-        <w:pStyle w:val="ListParagraph"/>
-        <w:numPr>
-          <w:ilvl w:val="0"/>
-          <w:numId w:val="5"/>
-        </w:numPr>
-      </w:pPr>
-      <w:r>
-        <w:t xml:space="preserve">Add the score to the popup editor so merchants see it before they publish.</w:t>
-      </w:r>
-    </w:p>
-    <w:p>
-      <w:pPr>
-        <w:pStyle w:val="ListParagraph"/>
-        <w:numPr>
-          <w:ilvl w:val="0"/>
-          <w:numId w:val="5"/>
+          <w:numId w:val="4"/>
         </w:numPr>
       </w:pPr>
       <w:r>
@@ -1014,9 +1045,6 @@
     <w:abstractNumId w:val="0"/>
   </w:num>
   <w:num w:numId="4">
-    <w:abstractNumId w:val="0"/>
-  </w:num>
-  <w:num w:numId="5">
     <w:abstractNumId w:val="1"/>
     <w:lvlOverride w:ilvl="0">
       <w:startOverride w:val="1"/>

</xml_diff>